<commit_message>
Project closeout: April 25 build photos, doc updates, and final messaging
- Add April 25 bed-build gallery (13 photos) and April 21 meeting minutes
- Update Project Charter, Scope Statement, Communication Management Plan to latest versions
- Add Lines of Effort, Progress Report, and Stakeholder Communications Summary to docs
- Promote Holden to Project Manager on team page
- Rename Amazon Wishlist to Paul's Bedding Wishlist; remove closed GoFundMe references
- Replace sponsors Live Tracker with Final Outcomes (40 beds built, 43 bedding sets)
- Rewrite home page Our Next Steps / Current Focus for project closeout
- Remove Money Raised KPI and Donation Intent tracker; raise bedding count cap above 40
- Add Phase 5 lessons learned for the April 21 final-push meeting

Co-Authored-By: Claude Opus 4.7 (1M context) <noreply@anthropic.com>
</commit_message>
<xml_diff>
--- a/docs/documents/planning/Project Charter.docx
+++ b/docs/documents/planning/Project Charter.docx
@@ -708,25 +708,7 @@
           </w:p>
           <w:p>
             <w:pPr>
-              <w:rPr>
-                <w:b w:val="0"/>
-                <w:bCs w:val="0"/>
-                <w:vertAlign w:val="baseline"/>
-              </w:rPr>
-            </w:pPr>
-            <w:r>
-              <w:rPr>
-                <w:rtl w:val="0"/>
-              </w:rPr>
-            </w:r>
-          </w:p>
-          <w:p>
-            <w:pPr>
-              <w:rPr>
-                <w:b w:val="0"/>
-                <w:bCs w:val="0"/>
-                <w:vertAlign w:val="baseline"/>
-              </w:rPr>
+              <w:rPr/>
             </w:pPr>
             <w:r>
               <w:rPr>
@@ -1038,17 +1020,15 @@
                 <w:color w:val="000000"/>
                 <w:sz w:val="24"/>
                 <w:szCs w:val="24"/>
-                <w:highlight w:val="yellow"/>
                 <w:u w:val="none"/>
                 <w:vertAlign w:val="baseline"/>
               </w:rPr>
             </w:pPr>
             <w:r>
               <w:rPr>
-                <w:highlight w:val="yellow"/>
-                <w:rtl w:val="0"/>
-              </w:rPr>
-              <w:t xml:space="preserve">*Insert E-signature*</w:t>
+                <w:rtl w:val="0"/>
+              </w:rPr>
+              <w:t xml:space="preserve">Paul Mele</w:t>
             </w:r>
             <w:r>
               <w:rPr>
@@ -1139,17 +1119,15 @@
                 <w:color w:val="000000"/>
                 <w:sz w:val="24"/>
                 <w:szCs w:val="24"/>
-                <w:highlight w:val="yellow"/>
                 <w:u w:val="none"/>
                 <w:vertAlign w:val="baseline"/>
               </w:rPr>
             </w:pPr>
             <w:r>
               <w:rPr>
-                <w:highlight w:val="yellow"/>
-                <w:rtl w:val="0"/>
-              </w:rPr>
-              <w:t xml:space="preserve">*Insert E-mail*</w:t>
+                <w:rtl w:val="0"/>
+              </w:rPr>
+              <w:t xml:space="preserve">paul.mele@shpbeds.org</w:t>
             </w:r>
             <w:r>
               <w:rPr>
@@ -1631,7 +1609,7 @@
       <w:tr>
         <w:trPr>
           <w:cantSplit w:val="0"/>
-          <w:trHeight w:val="360" w:hRule="atLeast"/>
+          <w:trHeight w:val="345" w:hRule="atLeast"/>
           <w:tblHeader w:val="0"/>
         </w:trPr>
         <w:tc>
@@ -1795,10 +1773,92 @@
     </w:p>
     <w:p>
       <w:pPr>
+        <w:rPr/>
+      </w:pPr>
+      <w:r>
         <w:rPr>
-          <w:vertAlign w:val="baseline"/>
+          <w:rtl w:val="0"/>
         </w:rPr>
-      </w:pPr>
+      </w:r>
+    </w:p>
+    <w:p>
+      <w:pPr>
+        <w:rPr/>
+      </w:pPr>
+      <w:r>
+        <w:rPr>
+          <w:rtl w:val="0"/>
+        </w:rPr>
+      </w:r>
+    </w:p>
+    <w:p>
+      <w:pPr>
+        <w:rPr>
+          <w:b w:val="1"/>
+          <w:bCs w:val="1"/>
+        </w:rPr>
+      </w:pPr>
+      <w:r>
+        <w:rPr>
+          <w:b w:val="1"/>
+          <w:bCs w:val="1"/>
+          <w:rtl w:val="0"/>
+        </w:rPr>
+        <w:t xml:space="preserve">Email Confirmation for E-Signature</w:t>
+      </w:r>
+    </w:p>
+    <w:p>
+      <w:pPr>
+        <w:rPr>
+          <w:b w:val="1"/>
+          <w:bCs w:val="1"/>
+        </w:rPr>
+      </w:pPr>
+      <w:r>
+        <w:rPr>
+          <w:rtl w:val="0"/>
+        </w:rPr>
+      </w:r>
+    </w:p>
+    <w:p>
+      <w:pPr>
+        <w:rPr/>
+      </w:pPr>
+      <w:r>
+        <w:rPr/>
+        <w:drawing>
+          <wp:inline distB="114300" distT="114300" distL="114300" distR="114300">
+            <wp:extent cx="5214938" cy="3069208"/>
+            <wp:effectExtent b="0" l="0" r="0" t="0"/>
+            <wp:docPr id="1" name="image1.png"/>
+            <a:graphic>
+              <a:graphicData uri="http://schemas.openxmlformats.org/drawingml/2006/picture">
+                <pic:pic>
+                  <pic:nvPicPr>
+                    <pic:cNvPr id="0" name="image1.png"/>
+                    <pic:cNvPicPr preferRelativeResize="0"/>
+                  </pic:nvPicPr>
+                  <pic:blipFill>
+                    <a:blip r:embed="rId7"/>
+                    <a:srcRect b="0" l="0" r="0" t="0"/>
+                    <a:stretch>
+                      <a:fillRect/>
+                    </a:stretch>
+                  </pic:blipFill>
+                  <pic:spPr>
+                    <a:xfrm>
+                      <a:off x="0" y="0"/>
+                      <a:ext cx="5214938" cy="3069208"/>
+                    </a:xfrm>
+                    <a:prstGeom prst="rect"/>
+                    <a:ln/>
+                  </pic:spPr>
+                </pic:pic>
+              </a:graphicData>
+            </a:graphic>
+          </wp:inline>
+        </w:drawing>
+      </w:r>
       <w:r>
         <w:rPr>
           <w:rtl w:val="0"/>

</xml_diff>